<commit_message>
Add Voina and Stoica (2023) source to formative CW3
Co-Authored-By: Claude Sonnet 5.5 <noreply@anthropic.com>
Claude-Session: https://claude.ai/code/session_01SJDfuviSYu7Z96SwMJrGH3
</commit_message>
<xml_diff>
--- a/out/Formative_CW3_revised.docx
+++ b/out/Formative_CW3_revised.docx
@@ -167,7 +167,7 @@
     </w:p>
     <w:p>
       <w:r>
-        <w:t>My lens is role congruity theory (Eagly and Karau, 2002): women leaders face a mismatch between expectations of women and of leaders, so identical behaviour may be judged differently. Eagly and Carli (2007) add the organisational barriers women face. Bass (1985) will assess what Ardern did, and Wilson (2020) gives an evidence-based account of her pandemic leadership. I will examine speeches, decisions and outcomes, and treat criticism of her record as counter-evidence, not as bias to dismiss.</w:t>
+        <w:t>My lens is role congruity theory (Eagly and Karau, 2002): women leaders face a mismatch between expectations of women and of leaders, so identical behaviour may be judged differently. Eagly and Carli (2007) add the organisational barriers women face. Bass (1985) will assess what Ardern did, and Wilson (2020) gives an evidence-based account of her pandemic leadership, and Voina and Stoica (2023) analyse her communication through an ethics of care. I will examine speeches, decisions and outcomes, and treat criticism of her record as counter-evidence, not as bias to dismiss.</w:t>
       </w:r>
     </w:p>
     <w:p>
@@ -185,7 +185,7 @@
     </w:p>
     <w:p>
       <w:r>
-        <w:t>Both cases test one claim: if leadership and management overlap, strong leaders need reliable systems, and perceptions of leadership are shaped by who the leader is. The main risks are relying on sources that praise leaders, reduced by comparing company and political statements with independent analysis, and over-attributing outcomes to personality or gender. The sources disagree: Kotter divides leadership from management, whereas Mintzberg finds them blended, and I will weigh classic arguments against recent peer-reviewed work such as Wilson (2020), and treat company and media accounts of Barra with caution.</w:t>
+        <w:t>Both cases test one claim: if leadership and management overlap, strong leaders need reliable systems, and perceptions of leadership are shaped by who the leader is. The main risks are relying on sources that praise leaders, reduced by comparing company and political statements with independent analysis, and over-attributing outcomes to personality or gender. The sources disagree: Kotter divides leadership from management, whereas Mintzberg finds them blended, and I will weigh classic arguments against recent peer-reviewed work such as Wilson (2020) and Voina and Stoica (2023), and treat company and media accounts of Barra with caution.</w:t>
       </w:r>
     </w:p>
     <w:p>
@@ -249,6 +249,11 @@
     <w:p>
       <w:r>
         <w:t>Northouse, P.G. (2021) Leadership: theory and practice. 9th edn. Thousand Oaks, CA: SAGE Publications.</w:t>
+      </w:r>
+    </w:p>
+    <w:p>
+      <w:r>
+        <w:t>Voina, A. and Stoica, M.S. (2023) 'Reframing leadership: Jacinda Ardern's response to the Covid-19 pandemic', Media and Communication, 11(1), pp. 139–149. doi:10.17645/mac.v11i1.6045.</w:t>
       </w:r>
     </w:p>
     <w:p>

</xml_diff>